<commit_message>
Regenerate the seven pairs whose addresses changed
c01 and the other four pairs are byte-identical.

Co-Authored-By: Claude Opus 5 <noreply@anthropic.com>
Claude-Session: https://claude.ai/code/session_016pH63xup3DLhwEedJo3bHT
</commit_message>
<xml_diff>
--- a/fixtures/generated/c02__single-column.docx
+++ b/fixtures/generated/c02__single-column.docx
@@ -27,12 +27,7 @@
     </w:p>
     <w:p>
       <w:r>
-        <w:t>Fermoy</w:t>
-      </w:r>
-    </w:p>
-    <w:p>
-      <w:r>
-        <w:t>Co. Cork</w:t>
+        <w:t>Kilworth Road</w:t>
       </w:r>
     </w:p>
     <w:p>

</xml_diff>